<commit_message>
Agrega ejecución en Google Colab (Tesla T4) como referencia
Resultados de results/colab_gpu/ con capturas de evidencia; predicciones
idénticas (mismo MD5) a las ejecuciones locales. Informe y README
actualizados.

Co-Authored-By: Claude Opus 5.5 <noreply@anthropic.com>
</commit_message>
<xml_diff>
--- a/docs/analisis_comparativo.docx
+++ b/docs/analisis_comparativo.docx
@@ -163,7 +163,7 @@
         <w:spacing w:after="120"/>
       </w:pPr>
       <w:r>
-        <w:t>En la ejecución de referencia (GPU integrada Apple M2 Pro, backend MPS de PyTorch, en equipo local), el modelo de NLP Town obtuvo el mejor desempeño (F1 macro 0,716, accuracy 0,766, recall de la clase negativa 0,842), frente a 0,588 de XLM-R y 0,514 de DistilmBERT. DistilmBERT fue 2,1 veces más rápido que el de NLP Town (204,5 frente a 98,4 reseñas/s), pero no alcanzó el umbral mínimo de calidad y casi nunca reconoce la clase neutral.</w:t>
+        <w:t>En la ejecución de referencia (GPU NVIDIA Tesla T4 en Google Colab), el modelo de NLP Town obtuvo el mejor desempeño (F1 macro 0,716, accuracy 0,766, recall de la clase negativa 0,842), frente a 0,588 de XLM-R y 0,514 de DistilmBERT. DistilmBERT fue 1,9 veces más rápido que el de NLP Town (247,7 frente a 131,1 reseñas/s), pero no alcanzó el umbral mínimo de calidad y casi nunca reconoce la clase neutral.</w:t>
       </w:r>
     </w:p>
     <w:p>
@@ -191,7 +191,7 @@
         <w:t xml:space="preserve">Nota sobre el entorno. </w:t>
       </w:r>
       <w:r>
-        <w:t>Las cifras de este documento provienen de la ejecución local de los scripts en un Apple M2 Pro (GPU vía MPS y CPU). El notebook de Google Colab con GPU CUDA implementa el mismo procedimiento; sus resultados se guardan en results/colab_gpu/. Las métricas de calidad no dependen del hardware (salvo diferencias numéricas mínimas); los tiempos sí, y deben leerse según el dispositivo indicado.</w:t>
+        <w:t>Las cifras de referencia provienen de la ejecución del notebook en Google Colab con una GPU NVIDIA Tesla T4. Los mismos procedimientos se ejecutaron con los scripts en un Apple M2 Pro (GPU vía MPS y CPU): las predicciones de los tres modelos fueron idénticas en los cuatro entornos (mismo hash MD5 del archivo de predicciones), por lo que las métricas de calidad no dependen del hardware; solo cambian los tiempos.</w:t>
       </w:r>
     </w:p>
     <w:p>
@@ -2922,7 +2922,7 @@
               <w:rPr>
                 <w:sz w:val="18"/>
               </w:rPr>
-              <w:t>GPU integrada Apple M2 Pro, backend MPS de PyTorch, en equipo local; 10 núcleos de CPU; 16.0 GB de RAM</w:t>
+              <w:t>GPU NVIDIA Tesla T4 en Google Colab; 2 núcleos de CPU; 12,7 GB de RAM</w:t>
             </w:r>
           </w:p>
         </w:tc>
@@ -2938,7 +2938,7 @@
               <w:rPr>
                 <w:sz w:val="18"/>
               </w:rPr>
-              <w:t>Entorno adicional</w:t>
+              <w:t>Entornos adicionales</w:t>
             </w:r>
           </w:p>
         </w:tc>
@@ -2952,7 +2952,7 @@
               <w:rPr>
                 <w:sz w:val="18"/>
               </w:rPr>
-              <w:t>CPU del mismo equipo (escenario sin GPU)</w:t>
+              <w:t>Apple M2 Pro (16 GB): GPU integrada vía MPS y CPU, con los scripts de src/; y el mismo notebook ejecutado en local para validar que scripts y notebook coinciden</w:t>
             </w:r>
           </w:p>
         </w:tc>
@@ -3012,7 +3012,7 @@
               <w:rPr>
                 <w:sz w:val="18"/>
               </w:rPr>
-              <w:t>Python 3.13.14, PyTorch 2.14.1, Transformers 5.19.0, Datasets 5.1.0, scikit-learn 1.9.1, pandas 3.0.6</w:t>
+              <w:t>Python 3.13.15, PyTorch 2.11.0+cu130, Transformers 5.19.0, Datasets 5.1.0, scikit-learn 1.6.1, pandas 2.2.3</w:t>
             </w:r>
           </w:p>
         </w:tc>
@@ -3795,7 +3795,7 @@
               <w:rPr>
                 <w:sz w:val="16"/>
               </w:rPr>
-              <w:t>10,16 ms/reseña</w:t>
+              <w:t>7,63 ms/reseña</w:t>
             </w:r>
           </w:p>
         </w:tc>
@@ -3809,7 +3809,7 @@
               <w:rPr>
                 <w:sz w:val="16"/>
               </w:rPr>
-              <w:t>9,29 ms/reseña</w:t>
+              <w:t>7,07 ms/reseña</w:t>
             </w:r>
           </w:p>
         </w:tc>
@@ -3823,7 +3823,7 @@
               <w:rPr>
                 <w:sz w:val="16"/>
               </w:rPr>
-              <w:t>4,89 ms/reseña</w:t>
+              <w:t>4,04 ms/reseña</w:t>
             </w:r>
           </w:p>
         </w:tc>
@@ -3853,7 +3853,7 @@
               <w:rPr>
                 <w:sz w:val="16"/>
               </w:rPr>
-              <w:t>98,4 reseñas/s</w:t>
+              <w:t>131,1 reseñas/s</w:t>
             </w:r>
           </w:p>
         </w:tc>
@@ -3867,7 +3867,7 @@
               <w:rPr>
                 <w:sz w:val="16"/>
               </w:rPr>
-              <w:t>107,6 reseñas/s</w:t>
+              <w:t>141,4 reseñas/s</w:t>
             </w:r>
           </w:p>
         </w:tc>
@@ -3881,7 +3881,7 @@
               <w:rPr>
                 <w:sz w:val="16"/>
               </w:rPr>
-              <w:t>204,5 reseñas/s</w:t>
+              <w:t>247,7 reseñas/s</w:t>
             </w:r>
           </w:p>
         </w:tc>
@@ -3911,7 +3911,7 @@
               <w:rPr>
                 <w:sz w:val="16"/>
               </w:rPr>
-              <w:t>50,8 ± 2,6 s</w:t>
+              <w:t>38,1 ± 1,5 s</w:t>
             </w:r>
           </w:p>
         </w:tc>
@@ -3925,7 +3925,7 @@
               <w:rPr>
                 <w:sz w:val="16"/>
               </w:rPr>
-              <w:t>46,4 ± 3,0 s</w:t>
+              <w:t>35,4 ± 0,2 s</w:t>
             </w:r>
           </w:p>
         </w:tc>
@@ -3939,7 +3939,7 @@
               <w:rPr>
                 <w:sz w:val="16"/>
               </w:rPr>
-              <w:t>24,5 ± 0,1 s</w:t>
+              <w:t>20,2 ± 0,1 s</w:t>
             </w:r>
           </w:p>
         </w:tc>
@@ -3969,7 +3969,7 @@
               <w:rPr>
                 <w:sz w:val="16"/>
               </w:rPr>
-              <w:t>25,3 / 40,9 ms</w:t>
+              <w:t>8,5 / 40,9 ms</w:t>
             </w:r>
           </w:p>
         </w:tc>
@@ -3983,7 +3983,7 @@
               <w:rPr>
                 <w:sz w:val="16"/>
               </w:rPr>
-              <w:t>11,7 / 18,5 ms</w:t>
+              <w:t>10,5 / 15,2 ms</w:t>
             </w:r>
           </w:p>
         </w:tc>
@@ -3997,7 +3997,7 @@
               <w:rPr>
                 <w:sz w:val="16"/>
               </w:rPr>
-              <w:t>7,7 / 13,2 ms</w:t>
+              <w:t>4,2 / 5,7 ms</w:t>
             </w:r>
           </w:p>
         </w:tc>
@@ -4027,7 +4027,7 @@
               <w:rPr>
                 <w:sz w:val="16"/>
               </w:rPr>
-              <w:t>1,3 s (caché local)</w:t>
+              <w:t>1,6 s (pesos en caché)</w:t>
             </w:r>
           </w:p>
         </w:tc>
@@ -4041,7 +4041,7 @@
               <w:rPr>
                 <w:sz w:val="16"/>
               </w:rPr>
-              <w:t>2,2 s (caché local)</w:t>
+              <w:t>6,1 s (pesos en caché)</w:t>
             </w:r>
           </w:p>
         </w:tc>
@@ -4055,7 +4055,7 @@
               <w:rPr>
                 <w:sz w:val="16"/>
               </w:rPr>
-              <w:t>0,9 s (caché local)</w:t>
+              <w:t>0,8 s (pesos en caché)</w:t>
             </w:r>
           </w:p>
         </w:tc>
@@ -4172,6 +4172,122 @@
                 <w:sz w:val="16"/>
               </w:rPr>
               <w:t>0,53 GB</w:t>
+            </w:r>
+          </w:p>
+        </w:tc>
+      </w:tr>
+      <w:tr>
+        <w:tc>
+          <w:tcPr>
+            <w:tcW w:type="dxa" w:w="2154"/>
+          </w:tcPr>
+          <w:p>
+            <w:r/>
+            <w:r>
+              <w:rPr>
+                <w:sz w:val="16"/>
+              </w:rPr>
+              <w:t>Memoria pico GPU [E]</w:t>
+            </w:r>
+          </w:p>
+        </w:tc>
+        <w:tc>
+          <w:tcPr>
+            <w:tcW w:type="dxa" w:w="2381"/>
+          </w:tcPr>
+          <w:p>
+            <w:r/>
+            <w:r>
+              <w:rPr>
+                <w:sz w:val="16"/>
+              </w:rPr>
+              <w:t>0,89 GB</w:t>
+            </w:r>
+          </w:p>
+        </w:tc>
+        <w:tc>
+          <w:tcPr>
+            <w:tcW w:type="dxa" w:w="2381"/>
+          </w:tcPr>
+          <w:p>
+            <w:r/>
+            <w:r>
+              <w:rPr>
+                <w:sz w:val="16"/>
+              </w:rPr>
+              <w:t>1,30 GB</w:t>
+            </w:r>
+          </w:p>
+        </w:tc>
+        <w:tc>
+          <w:tcPr>
+            <w:tcW w:type="dxa" w:w="2381"/>
+          </w:tcPr>
+          <w:p>
+            <w:r/>
+            <w:r>
+              <w:rPr>
+                <w:sz w:val="16"/>
+              </w:rPr>
+              <w:t>0,77 GB</w:t>
+            </w:r>
+          </w:p>
+        </w:tc>
+      </w:tr>
+      <w:tr>
+        <w:tc>
+          <w:tcPr>
+            <w:tcW w:type="dxa" w:w="2154"/>
+          </w:tcPr>
+          <w:p>
+            <w:r/>
+            <w:r>
+              <w:rPr>
+                <w:sz w:val="16"/>
+              </w:rPr>
+              <w:t>Rendimiento GPU Apple M2 Pro (MPS) [E]</w:t>
+            </w:r>
+          </w:p>
+        </w:tc>
+        <w:tc>
+          <w:tcPr>
+            <w:tcW w:type="dxa" w:w="2381"/>
+          </w:tcPr>
+          <w:p>
+            <w:r/>
+            <w:r>
+              <w:rPr>
+                <w:sz w:val="16"/>
+              </w:rPr>
+              <w:t>98,4 reseñas/s</w:t>
+            </w:r>
+          </w:p>
+        </w:tc>
+        <w:tc>
+          <w:tcPr>
+            <w:tcW w:type="dxa" w:w="2381"/>
+          </w:tcPr>
+          <w:p>
+            <w:r/>
+            <w:r>
+              <w:rPr>
+                <w:sz w:val="16"/>
+              </w:rPr>
+              <w:t>107,6 reseñas/s</w:t>
+            </w:r>
+          </w:p>
+        </w:tc>
+        <w:tc>
+          <w:tcPr>
+            <w:tcW w:type="dxa" w:w="2381"/>
+          </w:tcPr>
+          <w:p>
+            <w:r/>
+            <w:r>
+              <w:rPr>
+                <w:sz w:val="16"/>
+              </w:rPr>
+              <w:t>204,5 reseñas/s</w:t>
             </w:r>
           </w:p>
         </w:tc>
@@ -4477,21 +4593,7 @@
           <w:i/>
           <w:sz w:val="18"/>
         </w:rPr>
-        <w:t>Tabla 1. Comparación de los tres modelos. Ejecución de referencia: Apple MPS (arm) (2026-10-11). [E] experimental, [P] publicado, [Est] estimado.</w:t>
-      </w:r>
-    </w:p>
-    <w:p>
-      <w:pPr>
-        <w:spacing w:after="120"/>
-      </w:pPr>
-      <w:r>
-        <w:rPr>
-          <w:b/>
-        </w:rPr>
-        <w:t xml:space="preserve">Nota sobre memoria. </w:t>
-      </w:r>
-      <w:r>
-        <w:t>En MPS, torch.mps.driver_allocated_memory refleja la reserva del asignador y no se libera entre modelos (≈ 2 GB en los tres casos), por lo que no sirve para comparar modelos. Por eso se usa la estimación de memoria de pesos en FP32; en Colab, el notebook registra la memoria pico real con torch.cuda.max_memory_allocated.</w:t>
+        <w:t>Tabla 1. Comparación de los tres modelos. Ejecución de referencia: Tesla T4 (2026-10-12). [E] experimental, [P] publicado, [Est] estimado.</w:t>
       </w:r>
     </w:p>
     <w:p>
@@ -5562,7 +5664,7 @@
         <w:t xml:space="preserve">¿Qué modelo presenta menor latencia? </w:t>
       </w:r>
       <w:r>
-        <w:t>DistilmBERT: 4,89 ms por reseña en lote (204,5 reseñas/s) y p95 de 13,2 ms en línea, porque tiene la mitad de capas (6) que los otros dos.</w:t>
+        <w:t>DistilmBERT: 4,04 ms por reseña en lote (247,7 reseñas/s) y p95 de 5,7 ms en línea, porque tiene la mitad de capas (6) que los otros dos.</w:t>
       </w:r>
     </w:p>
     <w:p>
@@ -5590,7 +5692,7 @@
         <w:t xml:space="preserve">¿Qué modelo requiere más recursos? </w:t>
       </w:r>
       <w:r>
-        <w:t>XLM-R: 278 M de parámetros, ≈ 1,09 GB de pesos en FP32 y 1,04 GB de descarga.</w:t>
+        <w:t>XLM-R: 278 M de parámetros, ≈ 1,09 GB de pesos en FP32, 1,30 GB de memoria pico en la GPU (frente a 0,89 de NLP Town y 0,77 de DistilmBERT) y 1,04 GB de descarga.</w:t>
       </w:r>
     </w:p>
     <w:p>
@@ -5604,7 +5706,7 @@
         <w:t xml:space="preserve">¿Una mejora en F1 justifica un mayor tiempo de inferencia? </w:t>
       </w:r>
       <w:r>
-        <w:t>Sí en este caso. Pasar de DistilmBERT a NLP Town duplica el tiempo por reseña (4,9 → 10,2 ms), pero aumenta el F1 macro de 0,514 a 0,716 y el recall negativo de 0,668 a 0,842: de cada 1 000 quejas se escalarían unas 174 más. El tiempo adicional sigue dentro de los umbrales de latencia.</w:t>
+        <w:t>Sí en este caso. Pasar de DistilmBERT a NLP Town duplica el tiempo por reseña (4,0 → 7,6 ms), pero aumenta el F1 macro de 0,514 a 0,716 y el recall negativo de 0,668 a 0,842: de cada 1 000 quejas se escalarían unas 174 más. El tiempo adicional sigue dentro de los umbrales de latencia.</w:t>
       </w:r>
     </w:p>
     <w:p>
@@ -5618,7 +5720,7 @@
         <w:t xml:space="preserve">¿Qué ocurre si se deben procesar muchos registros? </w:t>
       </w:r>
       <w:r>
-        <w:t>Con el rendimiento medido, 100 000 reseñas diarias tardarían ≈ 17 min con NLP Town y ≈ 8 min con DistilmBERT en la GPU de referencia; en CPU, ≈ 36 y ≈ 18 min. Para un proceso nocturno por lotes, cualquiera es viable; para volúmenes mucho mayores conviene ordenar por longitud, usar FP16 en GPU o cuantizar.</w:t>
+        <w:t>Con el rendimiento medido, 100 000 reseñas diarias tardarían ≈ 13 min con NLP Town y ≈ 7 min con DistilmBERT en la GPU de referencia (Tesla T4); en CPU, ≈ 36 y ≈ 18 min. Para un proceso nocturno por lotes, cualquiera es viable; para volúmenes mucho mayores conviene ordenar por longitud, usar FP16 en GPU o cuantizar.</w:t>
       </w:r>
     </w:p>
     <w:p>
@@ -6120,7 +6222,7 @@
         <w:t xml:space="preserve">Eficiencia suficiente: </w:t>
       </w:r>
       <w:r>
-        <w:t>98,4 reseñas/s en lote y p95 de 40,9 ms en línea en la GPU de referencia; ambos dentro de los umbrales.</w:t>
+        <w:t>131,1 reseñas/s en lote y p95 de 40,9 ms en línea en la GPU de referencia; ambos dentro de los umbrales.</w:t>
       </w:r>
     </w:p>
     <w:p>
@@ -6158,7 +6260,7 @@
         <w:spacing w:after="120"/>
       </w:pPr>
       <w:r>
-        <w:t>XLM-R se descarta por calidad (F1 0,588; su intervalo de confianza [0,575; 0,601] apenas alcanza el umbral, y queda claramente por debajo de NLP Town) y porque no declara licencia; DistilmBERT, aunque 2,1× más rápido, no detecta la clase neutral (recall 0,086) y su recall negativo queda por debajo del umbral. La recomendación no se basa en accuracy sino en el cumplimiento conjunto de calidad, objetivo de negocio, eficiencia y licencia.</w:t>
+        <w:t>XLM-R se descarta por calidad (F1 0,588; su intervalo de confianza [0,575; 0,601] apenas alcanza el umbral, y queda claramente por debajo de NLP Town) y porque no declara licencia; DistilmBERT, aunque 1,9× más rápido, no detecta la clase neutral (recall 0,086) y su recall negativo queda por debajo del umbral. La recomendación no se basa en accuracy sino en el cumplimiento conjunto de calidad, objetivo de negocio, eficiencia y licencia.</w:t>
       </w:r>
     </w:p>
     <w:p>
@@ -6461,7 +6563,7 @@
               <w:rPr>
                 <w:sz w:val="16"/>
               </w:rPr>
-              <w:t>98,4 — Cumple</w:t>
+              <w:t>131,1 — Cumple</w:t>
             </w:r>
           </w:p>
         </w:tc>
@@ -6475,7 +6577,7 @@
               <w:rPr>
                 <w:sz w:val="16"/>
               </w:rPr>
-              <w:t>107,6 — Cumple</w:t>
+              <w:t>141,4 — Cumple</w:t>
             </w:r>
           </w:p>
         </w:tc>
@@ -6489,7 +6591,7 @@
               <w:rPr>
                 <w:sz w:val="16"/>
               </w:rPr>
-              <w:t>204,5 — Cumple</w:t>
+              <w:t>247,7 — Cumple</w:t>
             </w:r>
           </w:p>
         </w:tc>
@@ -6547,7 +6649,7 @@
               <w:rPr>
                 <w:sz w:val="16"/>
               </w:rPr>
-              <w:t>18,5 — Cumple</w:t>
+              <w:t>15,2 — Cumple</w:t>
             </w:r>
           </w:p>
         </w:tc>
@@ -6561,7 +6663,7 @@
               <w:rPr>
                 <w:sz w:val="16"/>
               </w:rPr>
-              <w:t>13,2 — Cumple</w:t>
+              <w:t>5,7 — Cumple</w:t>
             </w:r>
           </w:p>
         </w:tc>
@@ -6577,7 +6679,7 @@
               <w:rPr>
                 <w:sz w:val="16"/>
               </w:rPr>
-              <w:t>Memoria de pesos</w:t>
+              <w:t>Memoria pico GPU</w:t>
             </w:r>
           </w:p>
         </w:tc>
@@ -6605,7 +6707,7 @@
               <w:rPr>
                 <w:sz w:val="16"/>
               </w:rPr>
-              <w:t>0,65 GB [Est] — Cumple</w:t>
+              <w:t>0,89 GB — Cumple</w:t>
             </w:r>
           </w:p>
         </w:tc>
@@ -6619,7 +6721,7 @@
               <w:rPr>
                 <w:sz w:val="16"/>
               </w:rPr>
-              <w:t>1,09 GB [Est] — Cumple</w:t>
+              <w:t>1,30 GB — Cumple</w:t>
             </w:r>
           </w:p>
         </w:tc>
@@ -6633,7 +6735,7 @@
               <w:rPr>
                 <w:sz w:val="16"/>
               </w:rPr>
-              <w:t>0,53 GB [Est] — Cumple</w:t>
+              <w:t>0,77 GB — Cumple</w:t>
             </w:r>
           </w:p>
         </w:tc>
@@ -6645,7 +6747,7 @@
         <w:spacing w:after="120"/>
       </w:pPr>
       <w:r>
-        <w:t>Justificación: 0,60 de F1 macro es un mínimo útil para triaje en tres clases con una clase neutral ambigua; 0,75 de recall negativo asegura que se escalen al menos tres de cada cuatro quejas; 50 reseñas/s procesa 100 000 reseñas en ≈ 35 min; 100 ms se percibe como respuesta inmediata; 2 GB deja margen en una T4 de 16 GB. Los umbrales de GPU se evaluaron aquí con la GPU Apple (MPS); deben confirmarse con la ejecución en Colab.</w:t>
+        <w:t>Justificación: 0,60 de F1 macro es un mínimo útil para triaje en tres clases con una clase neutral ambigua; 0,75 de recall negativo asegura que se escalen al menos tres de cada cuatro quejas; 50 reseñas/s procesa 100 000 reseñas en ≈ 35 min; 100 ms se percibe como respuesta inmediata; 2 GB deja margen en una T4 de 16 GB. Los umbrales de GPU se verificaron con la Tesla T4 de Colab.</w:t>
       </w:r>
     </w:p>
     <w:tbl>
@@ -7561,7 +7663,7 @@
         <w:spacing w:after="120"/>
       </w:pPr>
       <w:r>
-        <w:t>Documento generado por docs/build_report.py a partir de results/local_mps/ (ejecución del 2026-10-11 23:30:09).</w:t>
+        <w:t>Documento generado por docs/build_report.py a partir de results/colab_gpu/ (ejecución del 2026-10-12 06:12:53).</w:t>
       </w:r>
     </w:p>
     <w:sectPr>

</xml_diff>